<commit_message>
Refresh AI-focused resume variants
</commit_message>
<xml_diff>
--- a/docs/downloads/bt-franklin-resume-application.docx
+++ b/docs/downloads/bt-franklin-resume-application.docx
@@ -116,52 +116,7 @@
           <w:color w:val="0C0C0C"/>
           <w:sz w:val="24"/>
         </w:rPr>
-        <w:t>Applied AI technical lead and software architect with 20+ years of experience across enterprise software, developer tooling, and product-facing systems.</w:t>
-      </w:r>
-    </w:p>
-    <w:p>
-      <w:pPr>
-        <w:pStyle w:val="ListBullet"/>
-        <w:spacing w:before="0" w:after="160"/>
-      </w:pPr>
-      <w:r>
-        <w:rPr>
-          <w:rFonts w:ascii="Helvetica Neue" w:hAnsi="Helvetica Neue" w:eastAsia="Helvetica Neue"/>
-          <w:i w:val="0"/>
-          <w:color w:val="0C0C0C"/>
-          <w:sz w:val="24"/>
-        </w:rPr>
-        <w:t>Focused on generative AI, large language models (LLMs), agentic systems, and AI product architecture.</w:t>
-      </w:r>
-    </w:p>
-    <w:p>
-      <w:pPr>
-        <w:pStyle w:val="ListBullet"/>
-        <w:spacing w:before="0" w:after="160"/>
-      </w:pPr>
-      <w:r>
-        <w:rPr>
-          <w:rFonts w:ascii="Helvetica Neue" w:hAnsi="Helvetica Neue" w:eastAsia="Helvetica Neue"/>
-          <w:i w:val="0"/>
-          <w:color w:val="0C0C0C"/>
-          <w:sz w:val="24"/>
-        </w:rPr>
-        <w:t>Experienced in moving emerging AI capabilities into useful engineering workflows and product experiences.</w:t>
-      </w:r>
-    </w:p>
-    <w:p>
-      <w:pPr>
-        <w:pStyle w:val="ListBullet"/>
-        <w:spacing w:before="0" w:after="160"/>
-      </w:pPr>
-      <w:r>
-        <w:rPr>
-          <w:rFonts w:ascii="Helvetica Neue" w:hAnsi="Helvetica Neue" w:eastAsia="Helvetica Neue"/>
-          <w:i w:val="0"/>
-          <w:color w:val="0C0C0C"/>
-          <w:sz w:val="24"/>
-        </w:rPr>
-        <w:t>Combines full-stack engineering depth with product thinking, UX sensibility, technical leadership, and published computational creativity research.</w:t>
+        <w:t>Applied AI technical lead and software architect with 20+ years of experience across enterprise software, developer tooling, and product-facing systems. Focused on generative AI, LLMs, agentic systems, multimodal AI integrations, AI product architecture, developer tooling, and full-stack AI product execution.</w:t>
       </w:r>
     </w:p>
     <w:p>
@@ -189,7 +144,7 @@
           <w:color w:val="0C0C0C"/>
           <w:sz w:val="24"/>
         </w:rPr>
-        <w:t>Applied AI and Large Language Model (LLM) Systems; Agentic Workflow Design and Agent Evaluation; AI Product Architecture; Developer Experience and Platform Tooling; Full-Stack Product Engineering; Technical Leadership.</w:t>
+        <w:t>Applied AI and LLM Systems; Agentic Workflow Design; MCP Server Architecture; RAG, Embeddings, and Semantic Matching; AI Product Architecture; Developer Experience and Platform Tooling; Full-Stack AI Product Engineering; Technical Leadership.</w:t>
       </w:r>
     </w:p>
     <w:p>
@@ -258,7 +213,7 @@
           <w:color w:val="0C0C0C"/>
           <w:sz w:val="24"/>
         </w:rPr>
-        <w:t>Serve as organization-wide AI technical leader, guiding engineering teams on adoption of large language models (LLMs), agents, evaluation practices, and modern AI development patterns aligned with business goals.</w:t>
+        <w:t>Serve as organization-wide AI technical leader, guiding engineering teams on adoption of LLMs, agents, evaluation practices, and modern AI development patterns aligned with business goals.</w:t>
       </w:r>
     </w:p>
     <w:p>
@@ -273,7 +228,7 @@
           <w:color w:val="0C0C0C"/>
           <w:sz w:val="24"/>
         </w:rPr>
-        <w:t>Architected the company's first Model Context Protocol (MCP) server and directed implementation by a third-party contractor, opening new enterprise revenue opportunities.</w:t>
+        <w:t>Architected the company's first Model Context Protocol (MCP) server, connecting the classic price management stack and formula evaluation service to agent workflows that retrieve calculated prices and explain start, target, and floor price reasoning.</w:t>
       </w:r>
     </w:p>
     <w:p>
@@ -288,7 +243,7 @@
           <w:color w:val="0C0C0C"/>
           <w:sz w:val="24"/>
         </w:rPr>
-        <w:t>Drove broad adoption of AI tooling across engineering, contributing to a significant increase in developer productivity.</w:t>
+        <w:t>Drove AI tooling adoption across engineering through Codex workflow training, reusable code-review skills, and agent-assisted development patterns that moved PR review and code-production workflows toward faster turnaround.</w:t>
       </w:r>
     </w:p>
     <w:p>
@@ -344,7 +299,22 @@
           <w:color w:val="0C0C0C"/>
           <w:sz w:val="24"/>
         </w:rPr>
-        <w:t>Led integration of AWS QuickSight and Amazon Q, improving data visualization capabilities, accelerating user adoption, and enhancing customer decision support.</w:t>
+        <w:t>Led integration of AWS QuickSight and Amazon Q, embedding analytics visualization and generative AI-assisted question answering into the product UI.</w:t>
+      </w:r>
+    </w:p>
+    <w:p>
+      <w:pPr>
+        <w:pStyle w:val="ListBullet"/>
+        <w:spacing w:before="0" w:after="160"/>
+      </w:pPr>
+      <w:r>
+        <w:rPr>
+          <w:rFonts w:ascii="Helvetica Neue" w:hAnsi="Helvetica Neue" w:eastAsia="Helvetica Neue"/>
+          <w:i w:val="0"/>
+          <w:color w:val="0C0C0C"/>
+          <w:sz w:val="24"/>
+        </w:rPr>
+        <w:t>Served as chief architect for a data access API and designed the Zilliant Developer Experience (ZDX) CLI, reducing complex configuration migration work from a multi-day process to a few hours.</w:t>
       </w:r>
     </w:p>
     <w:p>
@@ -385,22 +355,7 @@
           <w:color w:val="0C0C0C"/>
           <w:sz w:val="24"/>
         </w:rPr>
-        <w:t>Directed UI/UX strategy for enterprise Salesforce implementations, improving usability and aligning product experiences with business objectives across globally distributed teams.</w:t>
-      </w:r>
-    </w:p>
-    <w:p>
-      <w:pPr>
-        <w:pStyle w:val="ListBullet"/>
-        <w:spacing w:before="0" w:after="160"/>
-      </w:pPr>
-      <w:r>
-        <w:rPr>
-          <w:rFonts w:ascii="Helvetica Neue" w:hAnsi="Helvetica Neue" w:eastAsia="Helvetica Neue"/>
-          <w:i w:val="0"/>
-          <w:color w:val="0C0C0C"/>
-          <w:sz w:val="24"/>
-        </w:rPr>
-        <w:t>Contributed across full-stack engineering, Salesforce modernization, strategic proof-of-concept development, and long-running product evolution.</w:t>
+        <w:t>Led UI modernization, proof-of-concept development, and cross-team product architecture work across long-running enterprise platform evolution.</w:t>
       </w:r>
     </w:p>
     <w:p>
@@ -439,7 +394,7 @@
           <w:color w:val="0C0C0C"/>
           <w:sz w:val="24"/>
         </w:rPr>
-        <w:t xml:space="preserve"> Building an AI-powered organizational intelligence platform for GitHub repositories that analyzes architecture, contributor expertise, repository history, and live development activity to produce actionable engineering insights.</w:t>
+        <w:t xml:space="preserve"> Built and publicly deployed a solo GitHub App-backed repository intelligence SaaS for architecture analysis, contributor expertise modeling, hotspot detection, ownership-fragility signals, and AI-generated repository reports; later sunset and open-sourced as an archived reference project.</w:t>
       </w:r>
     </w:p>
     <w:p>
@@ -464,7 +419,7 @@
           <w:color w:val="0C0C0C"/>
           <w:sz w:val="24"/>
         </w:rPr>
-        <w:t xml:space="preserve"> Conceived, architected, and launched an AI recruiting platform focused on resume parsing, structured candidate extraction, and AI-assisted candidate-to-role matching.</w:t>
+        <w:t xml:space="preserve"> Built and deployed a complete solo AI recruiting SaaS in roughly two months, including Stripe Checkout, background workers, resume ingestion, structured extraction, OpenAI API processing, embeddings, Pinecone vector search, RAG-based candidate matching, and recruiter-facing UI.</w:t>
       </w:r>
     </w:p>
     <w:p>
@@ -475,11 +430,21 @@
       <w:r>
         <w:rPr>
           <w:rFonts w:ascii="Helvetica Neue" w:hAnsi="Helvetica Neue" w:eastAsia="Helvetica Neue"/>
+          <w:b/>
           <w:i w:val="0"/>
           <w:color w:val="0C0C0C"/>
           <w:sz w:val="24"/>
         </w:rPr>
-        <w:t>Built and published open-source AI and developer tooling spanning agent orchestration, AI grounding, prompt engineering, and engineering automation, including agentic-django, compendiumscribe, and promptdown.</w:t>
+        <w:t>Open source AI tooling:</w:t>
+      </w:r>
+      <w:r>
+        <w:rPr>
+          <w:rFonts w:ascii="Helvetica Neue" w:hAnsi="Helvetica Neue" w:eastAsia="Helvetica Neue"/>
+          <w:i w:val="0"/>
+          <w:color w:val="0C0C0C"/>
+          <w:sz w:val="24"/>
+        </w:rPr>
+        <w:t xml:space="preserve"> Created projects including contract4agents, agentic-django, agent-simulator, promptdown, compendiumscribe, release-notes-scribe, pywebview-htmx, and reusable AI agent skills.</w:t>
       </w:r>
     </w:p>
     <w:p>
@@ -581,7 +546,7 @@
           <w:color w:val="0C0C0C"/>
           <w:sz w:val="24"/>
         </w:rPr>
-        <w:t xml:space="preserve"> BA in Computer Science, 1997; Minor in Psychology; Graduated with Honors; Recipient of the Computer Science Award.</w:t>
+        <w:t xml:space="preserve"> BA in Computer Science, 1997; Minor in Psychology; Graduated with Honors.</w:t>
       </w:r>
     </w:p>
     <w:p>
@@ -605,45 +570,11 @@
       <w:r>
         <w:rPr>
           <w:rFonts w:ascii="Helvetica Neue" w:hAnsi="Helvetica Neue" w:eastAsia="Helvetica Neue"/>
-          <w:b/>
           <w:i w:val="0"/>
           <w:color w:val="0C0C0C"/>
           <w:sz w:val="24"/>
         </w:rPr>
-        <w:t>Programming Languages:</w:t>
-      </w:r>
-      <w:r>
-        <w:rPr>
-          <w:rFonts w:ascii="Helvetica Neue" w:hAnsi="Helvetica Neue" w:eastAsia="Helvetica Neue"/>
-          <w:i w:val="0"/>
-          <w:color w:val="0C0C0C"/>
-          <w:sz w:val="24"/>
-        </w:rPr>
-        <w:t xml:space="preserve"> Python, Java, JavaScript/TypeScript, Apex, Swift</w:t>
-      </w:r>
-    </w:p>
-    <w:p>
-      <w:pPr>
-        <w:spacing w:before="0" w:after="160"/>
-      </w:pPr>
-      <w:r>
-        <w:rPr>
-          <w:rFonts w:ascii="Helvetica Neue" w:hAnsi="Helvetica Neue" w:eastAsia="Helvetica Neue"/>
-          <w:b/>
-          <w:i w:val="0"/>
-          <w:color w:val="0C0C0C"/>
-          <w:sz w:val="24"/>
-        </w:rPr>
-        <w:t>Technologies:</w:t>
-      </w:r>
-      <w:r>
-        <w:rPr>
-          <w:rFonts w:ascii="Helvetica Neue" w:hAnsi="Helvetica Neue" w:eastAsia="Helvetica Neue"/>
-          <w:i w:val="0"/>
-          <w:color w:val="0C0C0C"/>
-          <w:sz w:val="24"/>
-        </w:rPr>
-        <w:t xml:space="preserve"> LLM Applications, Agentic Systems, Model Context Protocol (MCP), REST APIs, Salesforce Lightning, AWS QuickSight, Amazon Q, Visual Studio Code, oclif</w:t>
+        <w:t>Python; JavaScript/TypeScript; Java; OpenAI GPT, Image Generation, Embeddings, Speech-to-Text, and Interactive Voice; Anthropic Claude; ElevenLabs; Agentic Systems; MCP; RAG; Pinecone; Django; Celery; HTMX; Pydantic; PydanticAI; OpenAI Agents SDK; Codex; Docker; PostgreSQL; SQLite; AWS; QuickSight; Amazon Q; GitHub Actions; Terraform; React; Vue; Tailwind CSS; API Design; Platform Design; Technical Strategy.</w:t>
       </w:r>
     </w:p>
     <w:sectPr>

</xml_diff>

<commit_message>
Update resume after Zilliant departure
</commit_message>
<xml_diff>
--- a/docs/downloads/bt-franklin-resume-application.docx
+++ b/docs/downloads/bt-franklin-resume-application.docx
@@ -36,7 +36,7 @@
           <w:color w:val="0C0C0C"/>
           <w:sz w:val="24"/>
         </w:rPr>
-        <w:t>Applied AI Technical Lead</w:t>
+        <w:t>Applied AI Technical Lead / Software Architect</w:t>
       </w:r>
       <w:r>
         <w:br/>
@@ -198,7 +198,7 @@
           <w:color w:val="0C0C0C"/>
           <w:sz w:val="24"/>
         </w:rPr>
-        <w:t>April 2025 - Present</w:t>
+        <w:t>April 2025 - July 2026</w:t>
       </w:r>
     </w:p>
     <w:p>
@@ -213,7 +213,7 @@
           <w:color w:val="0C0C0C"/>
           <w:sz w:val="24"/>
         </w:rPr>
-        <w:t>Serve as organization-wide AI technical leader, guiding engineering teams on adoption of LLMs, agents, evaluation practices, and modern AI development patterns aligned with business goals.</w:t>
+        <w:t>Served as organization-wide AI technical leader, guiding engineering teams on adoption of LLMs, agents, evaluation practices, and modern AI development patterns aligned with business goals.</w:t>
       </w:r>
     </w:p>
     <w:p>
@@ -328,7 +328,7 @@
           <w:color w:val="0C0C0C"/>
           <w:sz w:val="24"/>
         </w:rPr>
-        <w:t>Earlier Zilliant Engineering Roles</w:t>
+        <w:t>Staff Software Engineer</w:t>
       </w:r>
       <w:r>
         <w:br/>
@@ -340,7 +340,7 @@
           <w:color w:val="0C0C0C"/>
           <w:sz w:val="24"/>
         </w:rPr>
-        <w:t>January 2009 - August 2022</w:t>
+        <w:t>February 2020 - August 2022</w:t>
       </w:r>
     </w:p>
     <w:p>
@@ -355,7 +355,48 @@
           <w:color w:val="0C0C0C"/>
           <w:sz w:val="24"/>
         </w:rPr>
-        <w:t>Led UI modernization, proof-of-concept development, and cross-team product architecture work across long-running enterprise platform evolution.</w:t>
+        <w:t>Led UI/UX strategy, proof-of-concept development, and cross-team product architecture work across enterprise platform evolution.</w:t>
+      </w:r>
+    </w:p>
+    <w:p>
+      <w:pPr>
+        <w:spacing w:before="0" w:after="160"/>
+      </w:pPr>
+      <w:r>
+        <w:rPr>
+          <w:rFonts w:ascii="Helvetica Neue" w:hAnsi="Helvetica Neue" w:eastAsia="Helvetica Neue"/>
+          <w:i/>
+          <w:color w:val="0C0C0C"/>
+          <w:sz w:val="24"/>
+        </w:rPr>
+        <w:t>Senior Software Engineer</w:t>
+      </w:r>
+      <w:r>
+        <w:br/>
+      </w:r>
+      <w:r>
+        <w:rPr>
+          <w:rFonts w:ascii="Helvetica Neue" w:hAnsi="Helvetica Neue" w:eastAsia="Helvetica Neue"/>
+          <w:i/>
+          <w:color w:val="0C0C0C"/>
+          <w:sz w:val="24"/>
+        </w:rPr>
+        <w:t>January 2009 - September 2019</w:t>
+      </w:r>
+    </w:p>
+    <w:p>
+      <w:pPr>
+        <w:pStyle w:val="ListBullet"/>
+        <w:spacing w:before="0" w:after="160"/>
+      </w:pPr>
+      <w:r>
+        <w:rPr>
+          <w:rFonts w:ascii="Helvetica Neue" w:hAnsi="Helvetica Neue" w:eastAsia="Helvetica Neue"/>
+          <w:i w:val="0"/>
+          <w:color w:val="0C0C0C"/>
+          <w:sz w:val="24"/>
+        </w:rPr>
+        <w:t>Led Salesforce Lightning Web Components adoption, SalesMax development, mentorship, and product modernization work across long-running enterprise systems.</w:t>
       </w:r>
     </w:p>
     <w:p>

</xml_diff>